<commit_message>
Enhance DTR PDF layout and ISUFST branding
</commit_message>
<xml_diff>
--- a/Header.docx
+++ b/Header.docx
@@ -18,12 +18,8 @@
       </w:pPr>
     </w:p>
     <w:sectPr>
-      <w:headerReference w:type="even" r:id="rId9"/>
-      <w:headerReference w:type="default" r:id="rId10"/>
-      <w:footerReference w:type="even" r:id="rId11"/>
-      <w:footerReference w:type="default" r:id="rId12"/>
-      <w:headerReference w:type="first" r:id="rId13"/>
-      <w:footerReference w:type="first" r:id="rId14"/>
+      <w:headerReference w:type="default" r:id="rId9"/>
+      <w:footerReference w:type="default" r:id="rId10"/>
       <w:pgSz w:w="11906" w:h="16838" w:code="9"/>
       <w:pgMar w:top="1440" w:right="1440" w:bottom="1440" w:left="1440" w:header="706" w:footer="706" w:gutter="0"/>
       <w:cols w:space="708"/>
@@ -59,16 +55,6 @@
 </file>
 
 <file path=word/footer1.xml><?xml version="1.0" encoding="utf-8"?>
-<w:ftr xmlns:wpc="http://schemas.microsoft.com/office/word/2010/wordprocessingCanvas" xmlns:cx="http://schemas.microsoft.com/office/drawing/2014/chartex" xmlns:cx1="http://schemas.microsoft.com/office/drawing/2015/9/8/chartex" xmlns:cx2="http://schemas.microsoft.com/office/drawing/2015/10/21/chartex" xmlns:cx3="http://schemas.microsoft.com/office/drawing/2016/5/9/chartex" xmlns:cx4="http://schemas.microsoft.com/office/drawing/2016/5/10/chartex" xmlns:cx5="http://schemas.microsoft.com/office/drawing/2016/5/11/chartex" xmlns:cx6="http://schemas.microsoft.com/office/drawing/2016/5/12/chartex" xmlns:cx7="http://schemas.microsoft.com/office/drawing/2016/5/13/chartex" xmlns:cx8="http://schemas.microsoft.com/office/drawing/2016/5/14/chartex" xmlns:mc="http://schemas.openxmlformats.org/markup-compatibility/2006" xmlns:aink="http://schemas.microsoft.com/office/drawing/2016/ink" xmlns:am3d="http://schemas.microsoft.com/office/drawing/2017/model3d" xmlns:o="urn:schemas-microsoft-com:office:office" xmlns:oel="http://schemas.microsoft.com/office/2019/extlst" xmlns:r="http://schemas.openxmlformats.org/officeDocument/2006/relationships" xmlns:m="http://schemas.openxmlformats.org/officeDocument/2006/math" xmlns:v="urn:schemas-microsoft-com:vml" xmlns:wp14="http://schemas.microsoft.com/office/word/2010/wordprocessingDrawing" xmlns:wp="http://schemas.openxmlformats.org/drawingml/2006/wordprocessingDrawing" xmlns:w10="urn:schemas-microsoft-com:office:word" xmlns:w="http://schemas.openxmlformats.org/wordprocessingml/2006/main" xmlns:w14="http://schemas.microsoft.com/office/word/2010/wordml" xmlns:w15="http://schemas.microsoft.com/office/word/2012/wordml" xmlns:w16cex="http://schemas.microsoft.com/office/word/2018/wordml/cex" xmlns:w16cid="http://schemas.microsoft.com/office/word/2016/wordml/cid" xmlns:w16="http://schemas.microsoft.com/office/word/2018/wordml" xmlns:w16du="http://schemas.microsoft.com/office/word/2023/wordml/word16du" xmlns:w16sdtdh="http://schemas.microsoft.com/office/word/2020/wordml/sdtdatahash" xmlns:w16sdtfl="http://schemas.microsoft.com/office/word/2024/wordml/sdtformatlock" xmlns:w16se="http://schemas.microsoft.com/office/word/2015/wordml/symex" xmlns:wpg="http://schemas.microsoft.com/office/word/2010/wordprocessingGroup" xmlns:wpi="http://schemas.microsoft.com/office/word/2010/wordprocessingInk" xmlns:wne="http://schemas.microsoft.com/office/word/2006/wordml" xmlns:wps="http://schemas.microsoft.com/office/word/2010/wordprocessingShape" mc:Ignorable="w14 w15 w16se w16cid w16 w16cex w16sdtdh w16sdtfl w16du wp14">
-  <w:p>
-    <w:pPr>
-      <w:pStyle w:val="Footer"/>
-    </w:pPr>
-  </w:p>
-</w:ftr>
-</file>
-
-<file path=word/footer2.xml><?xml version="1.0" encoding="utf-8"?>
 <w:ftr xmlns:wpc="http://schemas.microsoft.com/office/word/2010/wordprocessingCanvas" xmlns:cx="http://schemas.microsoft.com/office/drawing/2014/chartex" xmlns:cx1="http://schemas.microsoft.com/office/drawing/2015/9/8/chartex" xmlns:cx2="http://schemas.microsoft.com/office/drawing/2015/10/21/chartex" xmlns:cx3="http://schemas.microsoft.com/office/drawing/2016/5/9/chartex" xmlns:cx4="http://schemas.microsoft.com/office/drawing/2016/5/10/chartex" xmlns:cx5="http://schemas.microsoft.com/office/drawing/2016/5/11/chartex" xmlns:cx6="http://schemas.microsoft.com/office/drawing/2016/5/12/chartex" xmlns:cx7="http://schemas.microsoft.com/office/drawing/2016/5/13/chartex" xmlns:cx8="http://schemas.microsoft.com/office/drawing/2016/5/14/chartex" xmlns:mc="http://schemas.openxmlformats.org/markup-compatibility/2006" xmlns:aink="http://schemas.microsoft.com/office/drawing/2016/ink" xmlns:am3d="http://schemas.microsoft.com/office/drawing/2017/model3d" xmlns:o="urn:schemas-microsoft-com:office:office" xmlns:oel="http://schemas.microsoft.com/office/2019/extlst" xmlns:r="http://schemas.openxmlformats.org/officeDocument/2006/relationships" xmlns:m="http://schemas.openxmlformats.org/officeDocument/2006/math" xmlns:v="urn:schemas-microsoft-com:vml" xmlns:wp14="http://schemas.microsoft.com/office/word/2010/wordprocessingDrawing" xmlns:wp="http://schemas.openxmlformats.org/drawingml/2006/wordprocessingDrawing" xmlns:w10="urn:schemas-microsoft-com:office:word" xmlns:w="http://schemas.openxmlformats.org/wordprocessingml/2006/main" xmlns:w14="http://schemas.microsoft.com/office/word/2010/wordml" xmlns:w15="http://schemas.microsoft.com/office/word/2012/wordml" xmlns:w16cex="http://schemas.microsoft.com/office/word/2018/wordml/cex" xmlns:w16cid="http://schemas.microsoft.com/office/word/2016/wordml/cid" xmlns:w16="http://schemas.microsoft.com/office/word/2018/wordml" xmlns:w16du="http://schemas.microsoft.com/office/word/2023/wordml/word16du" xmlns:w16sdtdh="http://schemas.microsoft.com/office/word/2020/wordml/sdtdatahash" xmlns:w16sdtfl="http://schemas.microsoft.com/office/word/2024/wordml/sdtformatlock" xmlns:w16se="http://schemas.microsoft.com/office/word/2015/wordml/symex" xmlns:wpg="http://schemas.microsoft.com/office/word/2010/wordprocessingGroup" xmlns:wpi="http://schemas.microsoft.com/office/word/2010/wordprocessingInk" xmlns:wne="http://schemas.microsoft.com/office/word/2006/wordml" xmlns:wps="http://schemas.microsoft.com/office/word/2010/wordprocessingShape" mc:Ignorable="w14 w15 w16se w16cid w16 w16cex w16sdtdh w16sdtfl w16du wp14">
   <w:p>
     <w:pPr>
@@ -625,16 +611,6 @@
 </w:ftr>
 </file>
 
-<file path=word/footer3.xml><?xml version="1.0" encoding="utf-8"?>
-<w:ftr xmlns:wpc="http://schemas.microsoft.com/office/word/2010/wordprocessingCanvas" xmlns:cx="http://schemas.microsoft.com/office/drawing/2014/chartex" xmlns:cx1="http://schemas.microsoft.com/office/drawing/2015/9/8/chartex" xmlns:cx2="http://schemas.microsoft.com/office/drawing/2015/10/21/chartex" xmlns:cx3="http://schemas.microsoft.com/office/drawing/2016/5/9/chartex" xmlns:cx4="http://schemas.microsoft.com/office/drawing/2016/5/10/chartex" xmlns:cx5="http://schemas.microsoft.com/office/drawing/2016/5/11/chartex" xmlns:cx6="http://schemas.microsoft.com/office/drawing/2016/5/12/chartex" xmlns:cx7="http://schemas.microsoft.com/office/drawing/2016/5/13/chartex" xmlns:cx8="http://schemas.microsoft.com/office/drawing/2016/5/14/chartex" xmlns:mc="http://schemas.openxmlformats.org/markup-compatibility/2006" xmlns:aink="http://schemas.microsoft.com/office/drawing/2016/ink" xmlns:am3d="http://schemas.microsoft.com/office/drawing/2017/model3d" xmlns:o="urn:schemas-microsoft-com:office:office" xmlns:oel="http://schemas.microsoft.com/office/2019/extlst" xmlns:r="http://schemas.openxmlformats.org/officeDocument/2006/relationships" xmlns:m="http://schemas.openxmlformats.org/officeDocument/2006/math" xmlns:v="urn:schemas-microsoft-com:vml" xmlns:wp14="http://schemas.microsoft.com/office/word/2010/wordprocessingDrawing" xmlns:wp="http://schemas.openxmlformats.org/drawingml/2006/wordprocessingDrawing" xmlns:w10="urn:schemas-microsoft-com:office:word" xmlns:w="http://schemas.openxmlformats.org/wordprocessingml/2006/main" xmlns:w14="http://schemas.microsoft.com/office/word/2010/wordml" xmlns:w15="http://schemas.microsoft.com/office/word/2012/wordml" xmlns:w16cex="http://schemas.microsoft.com/office/word/2018/wordml/cex" xmlns:w16cid="http://schemas.microsoft.com/office/word/2016/wordml/cid" xmlns:w16="http://schemas.microsoft.com/office/word/2018/wordml" xmlns:w16du="http://schemas.microsoft.com/office/word/2023/wordml/word16du" xmlns:w16sdtdh="http://schemas.microsoft.com/office/word/2020/wordml/sdtdatahash" xmlns:w16sdtfl="http://schemas.microsoft.com/office/word/2024/wordml/sdtformatlock" xmlns:w16se="http://schemas.microsoft.com/office/word/2015/wordml/symex" xmlns:wpg="http://schemas.microsoft.com/office/word/2010/wordprocessingGroup" xmlns:wpi="http://schemas.microsoft.com/office/word/2010/wordprocessingInk" xmlns:wne="http://schemas.microsoft.com/office/word/2006/wordml" xmlns:wps="http://schemas.microsoft.com/office/word/2010/wordprocessingShape" mc:Ignorable="w14 w15 w16se w16cid w16 w16cex w16sdtdh w16sdtfl w16du wp14">
-  <w:p>
-    <w:pPr>
-      <w:pStyle w:val="Footer"/>
-    </w:pPr>
-  </w:p>
-</w:ftr>
-</file>
-
 <file path=word/footnotes.xml><?xml version="1.0" encoding="utf-8"?>
 <w:footnotes xmlns:wpc="http://schemas.microsoft.com/office/word/2010/wordprocessingCanvas" xmlns:cx="http://schemas.microsoft.com/office/drawing/2014/chartex" xmlns:cx1="http://schemas.microsoft.com/office/drawing/2015/9/8/chartex" xmlns:cx2="http://schemas.microsoft.com/office/drawing/2015/10/21/chartex" xmlns:cx3="http://schemas.microsoft.com/office/drawing/2016/5/9/chartex" xmlns:cx4="http://schemas.microsoft.com/office/drawing/2016/5/10/chartex" xmlns:cx5="http://schemas.microsoft.com/office/drawing/2016/5/11/chartex" xmlns:cx6="http://schemas.microsoft.com/office/drawing/2016/5/12/chartex" xmlns:cx7="http://schemas.microsoft.com/office/drawing/2016/5/13/chartex" xmlns:cx8="http://schemas.microsoft.com/office/drawing/2016/5/14/chartex" xmlns:mc="http://schemas.openxmlformats.org/markup-compatibility/2006" xmlns:aink="http://schemas.microsoft.com/office/drawing/2016/ink" xmlns:am3d="http://schemas.microsoft.com/office/drawing/2017/model3d" xmlns:o="urn:schemas-microsoft-com:office:office" xmlns:oel="http://schemas.microsoft.com/office/2019/extlst" xmlns:r="http://schemas.openxmlformats.org/officeDocument/2006/relationships" xmlns:m="http://schemas.openxmlformats.org/officeDocument/2006/math" xmlns:v="urn:schemas-microsoft-com:vml" xmlns:wp14="http://schemas.microsoft.com/office/word/2010/wordprocessingDrawing" xmlns:wp="http://schemas.openxmlformats.org/drawingml/2006/wordprocessingDrawing" xmlns:w10="urn:schemas-microsoft-com:office:word" xmlns:w="http://schemas.openxmlformats.org/wordprocessingml/2006/main" xmlns:w14="http://schemas.microsoft.com/office/word/2010/wordml" xmlns:w15="http://schemas.microsoft.com/office/word/2012/wordml" xmlns:w16cex="http://schemas.microsoft.com/office/word/2018/wordml/cex" xmlns:w16cid="http://schemas.microsoft.com/office/word/2016/wordml/cid" xmlns:w16="http://schemas.microsoft.com/office/word/2018/wordml" xmlns:w16du="http://schemas.microsoft.com/office/word/2023/wordml/word16du" xmlns:w16sdtdh="http://schemas.microsoft.com/office/word/2020/wordml/sdtdatahash" xmlns:w16sdtfl="http://schemas.microsoft.com/office/word/2024/wordml/sdtformatlock" xmlns:w16se="http://schemas.microsoft.com/office/word/2015/wordml/symex" xmlns:wpg="http://schemas.microsoft.com/office/word/2010/wordprocessingGroup" xmlns:wpi="http://schemas.microsoft.com/office/word/2010/wordprocessingInk" xmlns:wne="http://schemas.microsoft.com/office/word/2006/wordml" xmlns:wps="http://schemas.microsoft.com/office/word/2010/wordprocessingShape" mc:Ignorable="w14 w15 w16se w16cid w16 w16cex w16sdtdh w16sdtfl w16du wp14">
   <w:footnote w:type="separator" w:id="-1">
@@ -661,16 +637,6 @@
 </file>
 
 <file path=word/header1.xml><?xml version="1.0" encoding="utf-8"?>
-<w:hdr xmlns:wpc="http://schemas.microsoft.com/office/word/2010/wordprocessingCanvas" xmlns:cx="http://schemas.microsoft.com/office/drawing/2014/chartex" xmlns:cx1="http://schemas.microsoft.com/office/drawing/2015/9/8/chartex" xmlns:cx2="http://schemas.microsoft.com/office/drawing/2015/10/21/chartex" xmlns:cx3="http://schemas.microsoft.com/office/drawing/2016/5/9/chartex" xmlns:cx4="http://schemas.microsoft.com/office/drawing/2016/5/10/chartex" xmlns:cx5="http://schemas.microsoft.com/office/drawing/2016/5/11/chartex" xmlns:cx6="http://schemas.microsoft.com/office/drawing/2016/5/12/chartex" xmlns:cx7="http://schemas.microsoft.com/office/drawing/2016/5/13/chartex" xmlns:cx8="http://schemas.microsoft.com/office/drawing/2016/5/14/chartex" xmlns:mc="http://schemas.openxmlformats.org/markup-compatibility/2006" xmlns:aink="http://schemas.microsoft.com/office/drawing/2016/ink" xmlns:am3d="http://schemas.microsoft.com/office/drawing/2017/model3d" xmlns:o="urn:schemas-microsoft-com:office:office" xmlns:oel="http://schemas.microsoft.com/office/2019/extlst" xmlns:r="http://schemas.openxmlformats.org/officeDocument/2006/relationships" xmlns:m="http://schemas.openxmlformats.org/officeDocument/2006/math" xmlns:v="urn:schemas-microsoft-com:vml" xmlns:wp14="http://schemas.microsoft.com/office/word/2010/wordprocessingDrawing" xmlns:wp="http://schemas.openxmlformats.org/drawingml/2006/wordprocessingDrawing" xmlns:w10="urn:schemas-microsoft-com:office:word" xmlns:w="http://schemas.openxmlformats.org/wordprocessingml/2006/main" xmlns:w14="http://schemas.microsoft.com/office/word/2010/wordml" xmlns:w15="http://schemas.microsoft.com/office/word/2012/wordml" xmlns:w16cex="http://schemas.microsoft.com/office/word/2018/wordml/cex" xmlns:w16cid="http://schemas.microsoft.com/office/word/2016/wordml/cid" xmlns:w16="http://schemas.microsoft.com/office/word/2018/wordml" xmlns:w16du="http://schemas.microsoft.com/office/word/2023/wordml/word16du" xmlns:w16sdtdh="http://schemas.microsoft.com/office/word/2020/wordml/sdtdatahash" xmlns:w16sdtfl="http://schemas.microsoft.com/office/word/2024/wordml/sdtformatlock" xmlns:w16se="http://schemas.microsoft.com/office/word/2015/wordml/symex" xmlns:wpg="http://schemas.microsoft.com/office/word/2010/wordprocessingGroup" xmlns:wpi="http://schemas.microsoft.com/office/word/2010/wordprocessingInk" xmlns:wne="http://schemas.microsoft.com/office/word/2006/wordml" xmlns:wps="http://schemas.microsoft.com/office/word/2010/wordprocessingShape" mc:Ignorable="w14 w15 w16se w16cid w16 w16cex w16sdtdh w16sdtfl w16du wp14">
-  <w:p>
-    <w:pPr>
-      <w:pStyle w:val="Header"/>
-    </w:pPr>
-  </w:p>
-</w:hdr>
-</file>
-
-<file path=word/header2.xml><?xml version="1.0" encoding="utf-8"?>
 <w:hdr xmlns:wpc="http://schemas.microsoft.com/office/word/2010/wordprocessingCanvas" xmlns:cx="http://schemas.microsoft.com/office/drawing/2014/chartex" xmlns:cx1="http://schemas.microsoft.com/office/drawing/2015/9/8/chartex" xmlns:cx2="http://schemas.microsoft.com/office/drawing/2015/10/21/chartex" xmlns:cx3="http://schemas.microsoft.com/office/drawing/2016/5/9/chartex" xmlns:cx4="http://schemas.microsoft.com/office/drawing/2016/5/10/chartex" xmlns:cx5="http://schemas.microsoft.com/office/drawing/2016/5/11/chartex" xmlns:cx6="http://schemas.microsoft.com/office/drawing/2016/5/12/chartex" xmlns:cx7="http://schemas.microsoft.com/office/drawing/2016/5/13/chartex" xmlns:cx8="http://schemas.microsoft.com/office/drawing/2016/5/14/chartex" xmlns:mc="http://schemas.openxmlformats.org/markup-compatibility/2006" xmlns:aink="http://schemas.microsoft.com/office/drawing/2016/ink" xmlns:am3d="http://schemas.microsoft.com/office/drawing/2017/model3d" xmlns:o="urn:schemas-microsoft-com:office:office" xmlns:oel="http://schemas.microsoft.com/office/2019/extlst" xmlns:r="http://schemas.openxmlformats.org/officeDocument/2006/relationships" xmlns:m="http://schemas.openxmlformats.org/officeDocument/2006/math" xmlns:v="urn:schemas-microsoft-com:vml" xmlns:wp14="http://schemas.microsoft.com/office/word/2010/wordprocessingDrawing" xmlns:wp="http://schemas.openxmlformats.org/drawingml/2006/wordprocessingDrawing" xmlns:w10="urn:schemas-microsoft-com:office:word" xmlns:w="http://schemas.openxmlformats.org/wordprocessingml/2006/main" xmlns:w14="http://schemas.microsoft.com/office/word/2010/wordml" xmlns:w15="http://schemas.microsoft.com/office/word/2012/wordml" xmlns:w16cex="http://schemas.microsoft.com/office/word/2018/wordml/cex" xmlns:w16cid="http://schemas.microsoft.com/office/word/2016/wordml/cid" xmlns:w16="http://schemas.microsoft.com/office/word/2018/wordml" xmlns:w16du="http://schemas.microsoft.com/office/word/2023/wordml/word16du" xmlns:w16sdtdh="http://schemas.microsoft.com/office/word/2020/wordml/sdtdatahash" xmlns:w16sdtfl="http://schemas.microsoft.com/office/word/2024/wordml/sdtformatlock" xmlns:w16se="http://schemas.microsoft.com/office/word/2015/wordml/symex" xmlns:wpg="http://schemas.microsoft.com/office/word/2010/wordprocessingGroup" xmlns:wpi="http://schemas.microsoft.com/office/word/2010/wordprocessingInk" xmlns:wne="http://schemas.microsoft.com/office/word/2006/wordml" xmlns:wps="http://schemas.microsoft.com/office/word/2010/wordprocessingShape" mc:Ignorable="w14 w15 w16se w16cid w16 w16cex w16sdtdh w16sdtfl w16du wp14">
   <w:p>
     <w:pPr>
@@ -868,7 +834,34 @@
         <w:sz w:val="20"/>
         <w:szCs w:val="20"/>
       </w:rPr>
-      <w:t>COLLEGE OF INFORMATION AND COMMUNICATION TECHNOLOGY</w:t>
+      <w:t xml:space="preserve">   </w:t>
+    </w:r>
+    <w:r>
+      <w:rPr>
+        <w:rFonts w:ascii="Arial" w:eastAsia="Adobe Heiti Std R" w:hAnsi="Arial" w:cs="Arial"/>
+        <w:b/>
+        <w:sz w:val="20"/>
+        <w:szCs w:val="20"/>
+      </w:rPr>
+      <w:t>COLLEGE OF INFORMATION AND COMMUNICATION</w:t>
+    </w:r>
+    <w:r>
+      <w:rPr>
+        <w:rFonts w:ascii="Arial" w:eastAsia="Adobe Heiti Std R" w:hAnsi="Arial" w:cs="Arial"/>
+        <w:b/>
+        <w:sz w:val="20"/>
+        <w:szCs w:val="20"/>
+      </w:rPr>
+      <w:t>S</w:t>
+    </w:r>
+    <w:r>
+      <w:rPr>
+        <w:rFonts w:ascii="Arial" w:eastAsia="Adobe Heiti Std R" w:hAnsi="Arial" w:cs="Arial"/>
+        <w:b/>
+        <w:sz w:val="20"/>
+        <w:szCs w:val="20"/>
+      </w:rPr>
+      <w:t xml:space="preserve"> TECHNOLOGY</w:t>
     </w:r>
   </w:p>
   <w:p>
@@ -1011,16 +1004,6 @@
       </w:rPr>
       <w:t>+63)9634638274</w:t>
     </w:r>
-  </w:p>
-</w:hdr>
-</file>
-
-<file path=word/header3.xml><?xml version="1.0" encoding="utf-8"?>
-<w:hdr xmlns:wpc="http://schemas.microsoft.com/office/word/2010/wordprocessingCanvas" xmlns:cx="http://schemas.microsoft.com/office/drawing/2014/chartex" xmlns:cx1="http://schemas.microsoft.com/office/drawing/2015/9/8/chartex" xmlns:cx2="http://schemas.microsoft.com/office/drawing/2015/10/21/chartex" xmlns:cx3="http://schemas.microsoft.com/office/drawing/2016/5/9/chartex" xmlns:cx4="http://schemas.microsoft.com/office/drawing/2016/5/10/chartex" xmlns:cx5="http://schemas.microsoft.com/office/drawing/2016/5/11/chartex" xmlns:cx6="http://schemas.microsoft.com/office/drawing/2016/5/12/chartex" xmlns:cx7="http://schemas.microsoft.com/office/drawing/2016/5/13/chartex" xmlns:cx8="http://schemas.microsoft.com/office/drawing/2016/5/14/chartex" xmlns:mc="http://schemas.openxmlformats.org/markup-compatibility/2006" xmlns:aink="http://schemas.microsoft.com/office/drawing/2016/ink" xmlns:am3d="http://schemas.microsoft.com/office/drawing/2017/model3d" xmlns:o="urn:schemas-microsoft-com:office:office" xmlns:oel="http://schemas.microsoft.com/office/2019/extlst" xmlns:r="http://schemas.openxmlformats.org/officeDocument/2006/relationships" xmlns:m="http://schemas.openxmlformats.org/officeDocument/2006/math" xmlns:v="urn:schemas-microsoft-com:vml" xmlns:wp14="http://schemas.microsoft.com/office/word/2010/wordprocessingDrawing" xmlns:wp="http://schemas.openxmlformats.org/drawingml/2006/wordprocessingDrawing" xmlns:w10="urn:schemas-microsoft-com:office:word" xmlns:w="http://schemas.openxmlformats.org/wordprocessingml/2006/main" xmlns:w14="http://schemas.microsoft.com/office/word/2010/wordml" xmlns:w15="http://schemas.microsoft.com/office/word/2012/wordml" xmlns:w16cex="http://schemas.microsoft.com/office/word/2018/wordml/cex" xmlns:w16cid="http://schemas.microsoft.com/office/word/2016/wordml/cid" xmlns:w16="http://schemas.microsoft.com/office/word/2018/wordml" xmlns:w16du="http://schemas.microsoft.com/office/word/2023/wordml/word16du" xmlns:w16sdtdh="http://schemas.microsoft.com/office/word/2020/wordml/sdtdatahash" xmlns:w16sdtfl="http://schemas.microsoft.com/office/word/2024/wordml/sdtformatlock" xmlns:w16se="http://schemas.microsoft.com/office/word/2015/wordml/symex" xmlns:wpg="http://schemas.microsoft.com/office/word/2010/wordprocessingGroup" xmlns:wpi="http://schemas.microsoft.com/office/word/2010/wordprocessingInk" xmlns:wne="http://schemas.microsoft.com/office/word/2006/wordml" xmlns:wps="http://schemas.microsoft.com/office/word/2010/wordprocessingShape" mc:Ignorable="w14 w15 w16se w16cid w16 w16cex w16sdtdh w16sdtfl w16du wp14">
-  <w:p>
-    <w:pPr>
-      <w:pStyle w:val="Header"/>
-    </w:pPr>
   </w:p>
 </w:hdr>
 </file>
@@ -4284,6 +4267,10 @@
 </file>
 
 <file path=customXml/item1.xml><?xml version="1.0" encoding="utf-8"?>
+<b:Sources xmlns:b="http://schemas.openxmlformats.org/officeDocument/2006/bibliography" xmlns="http://schemas.openxmlformats.org/officeDocument/2006/bibliography" SelectedStyle="\APASixthEditionOfficeOnline.xsl" StyleName="APA" Version="6"/>
+</file>
+
+<file path=customXml/item2.xml><?xml version="1.0" encoding="utf-8"?>
 <s:customData xmlns="http://www.wps.cn/officeDocument/2013/wpsCustomData" xmlns:s="http://www.wps.cn/officeDocument/2013/wpsCustomData">
   <customSectProps/>
   <customShpExts>
@@ -4292,22 +4279,18 @@
 </s:customData>
 </file>
 
-<file path=customXml/item2.xml><?xml version="1.0" encoding="utf-8"?>
-<b:Sources xmlns:b="http://schemas.openxmlformats.org/officeDocument/2006/bibliography" xmlns="http://schemas.openxmlformats.org/officeDocument/2006/bibliography" SelectedStyle="\APASixthEditionOfficeOnline.xsl" StyleName="APA" Version="6"/>
+<file path=customXml/itemProps1.xml><?xml version="1.0" encoding="utf-8"?>
+<ds:datastoreItem xmlns:ds="http://schemas.openxmlformats.org/officeDocument/2006/customXml" ds:itemID="{6672A0F0-E063-4F55-A5D6-E6178AEBB20A}">
+  <ds:schemaRefs>
+    <ds:schemaRef ds:uri="http://schemas.openxmlformats.org/officeDocument/2006/bibliography"/>
+  </ds:schemaRefs>
+</ds:datastoreItem>
 </file>
 
-<file path=customXml/itemProps1.xml><?xml version="1.0" encoding="utf-8"?>
+<file path=customXml/itemProps2.xml><?xml version="1.0" encoding="utf-8"?>
 <ds:datastoreItem xmlns:ds="http://schemas.openxmlformats.org/officeDocument/2006/customXml" ds:itemID="{B1977F7D-205B-4081-913C-38D41E755F92}">
   <ds:schemaRefs>
     <ds:schemaRef ds:uri="http://www.wps.cn/officeDocument/2013/wpsCustomData"/>
   </ds:schemaRefs>
 </ds:datastoreItem>
-</file>
-
-<file path=customXml/itemProps2.xml><?xml version="1.0" encoding="utf-8"?>
-<ds:datastoreItem xmlns:ds="http://schemas.openxmlformats.org/officeDocument/2006/customXml" ds:itemID="{6672A0F0-E063-4F55-A5D6-E6178AEBB20A}">
-  <ds:schemaRefs>
-    <ds:schemaRef ds:uri="http://schemas.openxmlformats.org/officeDocument/2006/bibliography"/>
-  </ds:schemaRefs>
-</ds:datastoreItem>
 </file>
</xml_diff>